<commit_message>
Backup kode dari Icell_new ke branch backup-icell-old
</commit_message>
<xml_diff>
--- a/public/word-template/laporan_hasil_gelar_perkara.docx
+++ b/public/word-template/laporan_hasil_gelar_perkara.docx
@@ -1,6 +1,6 @@
 
 <file path=word/document.xml><?xml version="1.0" encoding="utf-8"?>
-<w:document xmlns:wpc="http://schemas.microsoft.com/office/word/2010/wordprocessingCanvas" xmlns:cx="http://schemas.microsoft.com/office/drawing/2014/chartex" xmlns:cx1="http://schemas.microsoft.com/office/drawing/2015/9/8/chartex" xmlns:cx2="http://schemas.microsoft.com/office/drawing/2015/10/21/chartex" xmlns:cx3="http://schemas.microsoft.com/office/drawing/2016/5/9/chartex" xmlns:cx4="http://schemas.microsoft.com/office/drawing/2016/5/10/chartex" xmlns:cx5="http://schemas.microsoft.com/office/drawing/2016/5/11/chartex" xmlns:cx6="http://schemas.microsoft.com/office/drawing/2016/5/12/chartex" xmlns:cx7="http://schemas.microsoft.com/office/drawing/2016/5/13/chartex" xmlns:cx8="http://schemas.microsoft.com/office/drawing/2016/5/14/chartex" xmlns:mc="http://schemas.openxmlformats.org/markup-compatibility/2006" xmlns:aink="http://schemas.microsoft.com/office/drawing/2016/ink" xmlns:am3d="http://schemas.microsoft.com/office/drawing/2017/model3d" xmlns:o="urn:schemas-microsoft-com:office:office" xmlns:oel="http://schemas.microsoft.com/office/2019/extlst" xmlns:r="http://schemas.openxmlformats.org/officeDocument/2006/relationships" xmlns:m="http://schemas.openxmlformats.org/officeDocument/2006/math" xmlns:v="urn:schemas-microsoft-com:vml" xmlns:wp14="http://schemas.microsoft.com/office/word/2010/wordprocessingDrawing" xmlns:wp="http://schemas.openxmlformats.org/drawingml/2006/wordprocessingDrawing" xmlns:w10="urn:schemas-microsoft-com:office:word" xmlns:w="http://schemas.openxmlformats.org/wordprocessingml/2006/main" xmlns:w14="http://schemas.microsoft.com/office/word/2010/wordml" xmlns:w15="http://schemas.microsoft.com/office/word/2012/wordml" xmlns:w16cex="http://schemas.microsoft.com/office/word/2018/wordml/cex" xmlns:w16cid="http://schemas.microsoft.com/office/word/2016/wordml/cid" xmlns:w16="http://schemas.microsoft.com/office/word/2018/wordml" xmlns:w16du="http://schemas.microsoft.com/office/word/2023/wordml/word16du" xmlns:w16sdtdh="http://schemas.microsoft.com/office/word/2020/wordml/sdtdatahash" xmlns:w16se="http://schemas.microsoft.com/office/word/2015/wordml/symex" xmlns:wpg="http://schemas.microsoft.com/office/word/2010/wordprocessingGroup" xmlns:wpi="http://schemas.microsoft.com/office/word/2010/wordprocessingInk" xmlns:wne="http://schemas.microsoft.com/office/word/2006/wordml" xmlns:wps="http://schemas.microsoft.com/office/word/2010/wordprocessingShape" mc:Ignorable="w14 w15 w16se w16cid w16 w16cex w16sdtdh w16du wp14">
+<w:document xmlns:wpc="http://schemas.microsoft.com/office/word/2010/wordprocessingCanvas" xmlns:cx="http://schemas.microsoft.com/office/drawing/2014/chartex" xmlns:cx1="http://schemas.microsoft.com/office/drawing/2015/9/8/chartex" xmlns:cx2="http://schemas.microsoft.com/office/drawing/2015/10/21/chartex" xmlns:cx3="http://schemas.microsoft.com/office/drawing/2016/5/9/chartex" xmlns:cx4="http://schemas.microsoft.com/office/drawing/2016/5/10/chartex" xmlns:cx5="http://schemas.microsoft.com/office/drawing/2016/5/11/chartex" xmlns:cx6="http://schemas.microsoft.com/office/drawing/2016/5/12/chartex" xmlns:cx7="http://schemas.microsoft.com/office/drawing/2016/5/13/chartex" xmlns:cx8="http://schemas.microsoft.com/office/drawing/2016/5/14/chartex" xmlns:mc="http://schemas.openxmlformats.org/markup-compatibility/2006" xmlns:aink="http://schemas.microsoft.com/office/drawing/2016/ink" xmlns:am3d="http://schemas.microsoft.com/office/drawing/2017/model3d" xmlns:o="urn:schemas-microsoft-com:office:office" xmlns:oel="http://schemas.microsoft.com/office/2019/extlst" xmlns:r="http://schemas.openxmlformats.org/officeDocument/2006/relationships" xmlns:m="http://schemas.openxmlformats.org/officeDocument/2006/math" xmlns:v="urn:schemas-microsoft-com:vml" xmlns:wp14="http://schemas.microsoft.com/office/word/2010/wordprocessingDrawing" xmlns:wp="http://schemas.openxmlformats.org/drawingml/2006/wordprocessingDrawing" xmlns:w10="urn:schemas-microsoft-com:office:word" xmlns:w="http://schemas.openxmlformats.org/wordprocessingml/2006/main" xmlns:w14="http://schemas.microsoft.com/office/word/2010/wordml" xmlns:w15="http://schemas.microsoft.com/office/word/2012/wordml" xmlns:w16cex="http://schemas.microsoft.com/office/word/2018/wordml/cex" xmlns:w16cid="http://schemas.microsoft.com/office/word/2016/wordml/cid" xmlns:w16="http://schemas.microsoft.com/office/word/2018/wordml" xmlns:w16du="http://schemas.microsoft.com/office/word/2023/wordml/word16du" xmlns:w16sdtdh="http://schemas.microsoft.com/office/word/2020/wordml/sdtdatahash" xmlns:w16sdtfl="http://schemas.microsoft.com/office/word/2024/wordml/sdtformatlock" xmlns:w16se="http://schemas.microsoft.com/office/word/2015/wordml/symex" xmlns:wpg="http://schemas.microsoft.com/office/word/2010/wordprocessingGroup" xmlns:wpi="http://schemas.microsoft.com/office/word/2010/wordprocessingInk" xmlns:wne="http://schemas.microsoft.com/office/word/2006/wordml" xmlns:wps="http://schemas.microsoft.com/office/word/2010/wordprocessingShape" mc:Ignorable="w14 w15 w16se w16cid w16 w16cex w16sdtdh w16sdtfl w16du wp14">
   <w:body>
     <w:tbl>
       <w:tblPr>
@@ -207,7 +207,7 @@
                 <w:sz w:val="24"/>
                 <w:szCs w:val="24"/>
               </w:rPr>
-              <w:object w:dxaOrig="1440" w:dyaOrig="1440" w14:anchorId="44D9F709">
+              <w:object w:dxaOrig="1440" w:dyaOrig="1440" w14:anchorId="105C8167">
                 <v:shapetype id="_x0000_t75" coordsize="21600,21600" o:spt="75" o:preferrelative="t" path="m@4@5l@4@11@9@11@9@5xe" filled="f" stroked="f">
                   <v:stroke joinstyle="miter"/>
                   <v:formulas>
@@ -227,10 +227,10 @@
                   <v:path o:extrusionok="f" gradientshapeok="t" o:connecttype="rect"/>
                   <o:lock v:ext="edit" aspectratio="t"/>
                 </v:shapetype>
-                <v:shape id="_x0000_s1026" type="#_x0000_t75" style="position:absolute;left:0;text-align:left;margin-left:209.15pt;margin-top:2.25pt;width:62.3pt;height:61.3pt;z-index:251655168;mso-position-horizontal-relative:text;mso-position-vertical-relative:text" wrapcoords="-237 0 -237 21337 21600 21337 21600 0 -237 0">
+                <v:shape id="_x0000_s1026" type="#_x0000_t75" alt="" style="position:absolute;left:0;text-align:left;margin-left:209.15pt;margin-top:2.25pt;width:62.3pt;height:61.3pt;z-index:251655168;mso-wrap-edited:f;mso-width-percent:0;mso-height-percent:0;mso-position-horizontal-relative:text;mso-position-vertical-relative:text;mso-width-percent:0;mso-height-percent:0" wrapcoords="-237 0 -237 21337 21600 21337 21600 0 -237 0">
                   <v:imagedata r:id="rId5" o:title=""/>
                 </v:shape>
-                <o:OLEObject Type="Embed" ProgID="Word.Picture.8" ShapeID="_x0000_s1026" DrawAspect="Content" ObjectID="_1789903541" r:id="rId6"/>
+                <o:OLEObject Type="Embed" ProgID="Word.Picture.8" ShapeID="_x0000_s1026" DrawAspect="Content" ObjectID="_1829216315" r:id="rId6"/>
               </w:object>
             </w:r>
           </w:p>
@@ -488,6 +488,14 @@
               </w:rPr>
               <w:t>}</w:t>
             </w:r>
+            <w:r>
+              <w:rPr>
+                <w:rFonts w:ascii="Arial Narrow" w:hAnsi="Arial Narrow"/>
+                <w:sz w:val="24"/>
+                <w:szCs w:val="24"/>
+              </w:rPr>
+              <w:t xml:space="preserve"> tanggal ${accident_date}</w:t>
+            </w:r>
           </w:p>
         </w:tc>
       </w:tr>
@@ -608,6 +616,46 @@
               </w:rPr>
               <w:t>}</w:t>
             </w:r>
+            <w:r>
+              <w:rPr>
+                <w:rFonts w:ascii="Arial Narrow" w:hAnsi="Arial Narrow"/>
+                <w:sz w:val="24"/>
+                <w:szCs w:val="24"/>
+              </w:rPr>
+              <w:t xml:space="preserve"> tanggal </w:t>
+            </w:r>
+            <w:r>
+              <w:rPr>
+                <w:rFonts w:ascii="Arial Narrow" w:hAnsi="Arial Narrow"/>
+                <w:sz w:val="24"/>
+                <w:szCs w:val="24"/>
+              </w:rPr>
+              <w:t>$</w:t>
+            </w:r>
+            <w:r>
+              <w:rPr>
+                <w:rFonts w:ascii="Arial Narrow" w:hAnsi="Arial Narrow"/>
+                <w:sz w:val="24"/>
+                <w:szCs w:val="24"/>
+              </w:rPr>
+              <w:t>{</w:t>
+            </w:r>
+            <w:r>
+              <w:rPr>
+                <w:rFonts w:ascii="Arial Narrow" w:hAnsi="Arial Narrow"/>
+                <w:sz w:val="24"/>
+                <w:szCs w:val="24"/>
+              </w:rPr>
+              <w:t>documentDate</w:t>
+            </w:r>
+            <w:r>
+              <w:rPr>
+                <w:rFonts w:ascii="Arial Narrow" w:hAnsi="Arial Narrow"/>
+                <w:sz w:val="24"/>
+                <w:szCs w:val="24"/>
+              </w:rPr>
+              <w:t>}</w:t>
+            </w:r>
           </w:p>
         </w:tc>
       </w:tr>
@@ -699,7 +747,95 @@
                 <w:sz w:val="24"/>
                 <w:szCs w:val="24"/>
               </w:rPr>
-              <w:t xml:space="preserve"> Tentang Undangan gelar perkara.</w:t>
+              <w:t xml:space="preserve"> tanggal</w:t>
+            </w:r>
+            <w:r>
+              <w:rPr>
+                <w:rFonts w:ascii="Arial Narrow" w:hAnsi="Arial Narrow"/>
+                <w:sz w:val="24"/>
+                <w:szCs w:val="24"/>
+              </w:rPr>
+              <w:t xml:space="preserve"> </w:t>
+            </w:r>
+            <w:r>
+              <w:rPr>
+                <w:rFonts w:ascii="Arial Narrow" w:hAnsi="Arial Narrow"/>
+                <w:sz w:val="24"/>
+                <w:szCs w:val="24"/>
+              </w:rPr>
+              <w:t>$</w:t>
+            </w:r>
+            <w:r>
+              <w:rPr>
+                <w:rFonts w:ascii="Arial Narrow" w:hAnsi="Arial Narrow"/>
+                <w:sz w:val="24"/>
+                <w:szCs w:val="24"/>
+              </w:rPr>
+              <w:t>{</w:t>
+            </w:r>
+            <w:r>
+              <w:rPr>
+                <w:rFonts w:ascii="Arial Narrow" w:hAnsi="Arial Narrow"/>
+                <w:sz w:val="24"/>
+                <w:szCs w:val="24"/>
+              </w:rPr>
+              <w:t>documentDate</w:t>
+            </w:r>
+            <w:r>
+              <w:rPr>
+                <w:rFonts w:ascii="Arial Narrow" w:hAnsi="Arial Narrow"/>
+                <w:sz w:val="24"/>
+                <w:szCs w:val="24"/>
+              </w:rPr>
+              <w:t>}</w:t>
+            </w:r>
+            <w:r>
+              <w:rPr>
+                <w:rFonts w:ascii="Arial Narrow" w:hAnsi="Arial Narrow"/>
+                <w:sz w:val="24"/>
+                <w:szCs w:val="24"/>
+              </w:rPr>
+              <w:t xml:space="preserve"> hal</w:t>
+            </w:r>
+            <w:r>
+              <w:rPr>
+                <w:rFonts w:ascii="Arial Narrow" w:hAnsi="Arial Narrow"/>
+                <w:sz w:val="24"/>
+                <w:szCs w:val="24"/>
+              </w:rPr>
+              <w:t xml:space="preserve"> </w:t>
+            </w:r>
+            <w:r>
+              <w:rPr>
+                <w:rFonts w:ascii="Arial Narrow" w:hAnsi="Arial Narrow"/>
+                <w:sz w:val="24"/>
+                <w:szCs w:val="24"/>
+              </w:rPr>
+              <w:t>u</w:t>
+            </w:r>
+            <w:r>
+              <w:rPr>
+                <w:rFonts w:ascii="Arial Narrow" w:hAnsi="Arial Narrow"/>
+                <w:sz w:val="24"/>
+                <w:szCs w:val="24"/>
+              </w:rPr>
+              <w:t xml:space="preserve">ndangan gelar </w:t>
+            </w:r>
+            <w:r>
+              <w:rPr>
+                <w:rFonts w:ascii="Arial Narrow" w:hAnsi="Arial Narrow"/>
+                <w:sz w:val="24"/>
+                <w:szCs w:val="24"/>
+              </w:rPr>
+              <w:t>P</w:t>
+            </w:r>
+            <w:r>
+              <w:rPr>
+                <w:rFonts w:ascii="Arial Narrow" w:hAnsi="Arial Narrow"/>
+                <w:sz w:val="24"/>
+                <w:szCs w:val="24"/>
+              </w:rPr>
+              <w:t>erkara.</w:t>
             </w:r>
           </w:p>
         </w:tc>
@@ -729,6 +865,7 @@
           <w:insideH w:val="none" w:sz="0" w:space="0" w:color="auto"/>
           <w:insideV w:val="none" w:sz="0" w:space="0" w:color="auto"/>
         </w:tblBorders>
+        <w:tblLayout w:type="fixed"/>
         <w:tblCellMar>
           <w:left w:w="0" w:type="dxa"/>
           <w:right w:w="0" w:type="dxa"/>
@@ -740,10 +877,7 @@
         <w:gridCol w:w="283"/>
         <w:gridCol w:w="2127"/>
         <w:gridCol w:w="141"/>
-        <w:gridCol w:w="284"/>
-        <w:gridCol w:w="1417"/>
-        <w:gridCol w:w="142"/>
-        <w:gridCol w:w="5122"/>
+        <w:gridCol w:w="6965"/>
       </w:tblGrid>
       <w:tr>
         <w:tc>
@@ -779,7 +913,7 @@
         <w:tc>
           <w:tcPr>
             <w:tcW w:w="9516" w:type="dxa"/>
-            <w:gridSpan w:val="7"/>
+            <w:gridSpan w:val="4"/>
           </w:tcPr>
           <w:p>
             <w:pPr>
@@ -834,7 +968,7 @@
                 <w:sz w:val="24"/>
                 <w:szCs w:val="24"/>
               </w:rPr>
-              <w:t>a.</w:t>
+              <w:t>1.</w:t>
             </w:r>
           </w:p>
         </w:tc>
@@ -846,18 +980,19 @@
             <w:pPr>
               <w:rPr>
                 <w:rFonts w:ascii="Arial Narrow" w:hAnsi="Arial Narrow"/>
-                <w:sz w:val="24"/>
-                <w:szCs w:val="24"/>
-              </w:rPr>
-            </w:pPr>
-            <w:r>
-              <w:rPr>
-                <w:rFonts w:ascii="Arial Narrow" w:hAnsi="Arial Narrow"/>
                 <w:color w:val="000000"/>
                 <w:sz w:val="24"/>
                 <w:szCs w:val="24"/>
               </w:rPr>
-              <w:t>Permasalahan</w:t>
+            </w:pPr>
+            <w:r>
+              <w:rPr>
+                <w:rFonts w:ascii="Arial Narrow" w:hAnsi="Arial Narrow"/>
+                <w:color w:val="000000"/>
+                <w:sz w:val="24"/>
+                <w:szCs w:val="24"/>
+              </w:rPr>
+              <w:t>Pelaksana</w:t>
             </w:r>
           </w:p>
         </w:tc>
@@ -886,63 +1021,22 @@
         <w:tc>
           <w:tcPr>
             <w:tcW w:w="6965" w:type="dxa"/>
-            <w:gridSpan w:val="4"/>
-          </w:tcPr>
-          <w:p>
-            <w:pPr>
-              <w:rPr>
-                <w:rFonts w:ascii="Arial Narrow" w:hAnsi="Arial Narrow"/>
-                <w:sz w:val="24"/>
-                <w:szCs w:val="24"/>
-              </w:rPr>
-            </w:pPr>
-            <w:r>
-              <w:rPr>
-                <w:rFonts w:ascii="Arial Narrow" w:hAnsi="Arial Narrow"/>
-                <w:sz w:val="24"/>
-                <w:szCs w:val="24"/>
-              </w:rPr>
-              <w:t xml:space="preserve">tindak pidana </w:t>
-            </w:r>
-            <w:r>
-              <w:rPr>
-                <w:rFonts w:ascii="Arial Narrow" w:hAnsi="Arial Narrow"/>
-                <w:sz w:val="24"/>
-                <w:szCs w:val="24"/>
-              </w:rPr>
-              <w:t>Kecelakaan Lalu Lintas</w:t>
-            </w:r>
-            <w:r>
-              <w:rPr>
-                <w:rFonts w:ascii="Arial Narrow" w:hAnsi="Arial Narrow"/>
-                <w:sz w:val="24"/>
-                <w:szCs w:val="24"/>
-              </w:rPr>
-              <w:t xml:space="preserve"> sebagaimana dimaksud dalam</w:t>
-            </w:r>
-            <w:r>
-              <w:rPr>
-                <w:rFonts w:ascii="Arial Narrow" w:hAnsi="Arial Narrow"/>
-                <w:sz w:val="24"/>
-                <w:szCs w:val="24"/>
-              </w:rPr>
-              <w:t xml:space="preserve"> </w:t>
-            </w:r>
-            <w:r>
-              <w:rPr>
-                <w:rFonts w:ascii="Arial Narrow" w:hAnsi="Arial Narrow"/>
-                <w:sz w:val="24"/>
-                <w:szCs w:val="24"/>
-              </w:rPr>
-              <w:t>Undang-Undang Nomor 22 Tahun 2009, tentang Lalu Lintas dan Angkutan Jalan</w:t>
-            </w:r>
-            <w:r>
-              <w:rPr>
-                <w:rFonts w:ascii="Arial Narrow" w:hAnsi="Arial Narrow"/>
-                <w:sz w:val="24"/>
-                <w:szCs w:val="24"/>
-              </w:rPr>
-              <w:t>, dalam Pasal 273, Pasal 275(2), Pasal 310, Pasal 311, dan Pasal 312.</w:t>
+          </w:tcPr>
+          <w:p>
+            <w:pPr>
+              <w:rPr>
+                <w:rFonts w:ascii="Arial Narrow" w:hAnsi="Arial Narrow"/>
+                <w:sz w:val="24"/>
+                <w:szCs w:val="24"/>
+              </w:rPr>
+            </w:pPr>
+            <w:r>
+              <w:rPr>
+                <w:rFonts w:ascii="Arial Narrow" w:hAnsi="Arial Narrow"/>
+                <w:sz w:val="24"/>
+                <w:szCs w:val="24"/>
+              </w:rPr>
+              <w:t>${implementer}</w:t>
             </w:r>
           </w:p>
         </w:tc>
@@ -980,7 +1074,15 @@
                 <w:sz w:val="24"/>
                 <w:szCs w:val="24"/>
               </w:rPr>
-              <w:t>b.</w:t>
+              <w:t>2</w:t>
+            </w:r>
+            <w:r>
+              <w:rPr>
+                <w:rFonts w:ascii="Arial Narrow" w:hAnsi="Arial Narrow"/>
+                <w:sz w:val="24"/>
+                <w:szCs w:val="24"/>
+              </w:rPr>
+              <w:t>.</w:t>
             </w:r>
           </w:p>
         </w:tc>
@@ -1003,7 +1105,7 @@
                 <w:sz w:val="24"/>
                 <w:szCs w:val="24"/>
               </w:rPr>
-              <w:t>Hari dan tanggal</w:t>
+              <w:t>Permasalahan</w:t>
             </w:r>
           </w:p>
         </w:tc>
@@ -1032,23 +1134,62 @@
         <w:tc>
           <w:tcPr>
             <w:tcW w:w="6965" w:type="dxa"/>
-            <w:gridSpan w:val="4"/>
-          </w:tcPr>
-          <w:p>
-            <w:pPr>
-              <w:rPr>
-                <w:rFonts w:ascii="Arial Narrow" w:hAnsi="Arial Narrow"/>
-                <w:sz w:val="24"/>
-                <w:szCs w:val="24"/>
-              </w:rPr>
-            </w:pPr>
-            <w:r>
-              <w:rPr>
-                <w:rFonts w:ascii="Arial Narrow" w:hAnsi="Arial Narrow"/>
-                <w:sz w:val="24"/>
-                <w:szCs w:val="24"/>
-              </w:rPr>
-              <w:t>${dayDate}</w:t>
+          </w:tcPr>
+          <w:p>
+            <w:pPr>
+              <w:rPr>
+                <w:rFonts w:ascii="Arial Narrow" w:hAnsi="Arial Narrow"/>
+                <w:sz w:val="24"/>
+                <w:szCs w:val="24"/>
+              </w:rPr>
+            </w:pPr>
+            <w:r>
+              <w:rPr>
+                <w:rFonts w:ascii="Arial Narrow" w:hAnsi="Arial Narrow"/>
+                <w:sz w:val="24"/>
+                <w:szCs w:val="24"/>
+              </w:rPr>
+              <w:t xml:space="preserve">tindak pidana </w:t>
+            </w:r>
+            <w:r>
+              <w:rPr>
+                <w:rFonts w:ascii="Arial Narrow" w:hAnsi="Arial Narrow"/>
+                <w:sz w:val="24"/>
+                <w:szCs w:val="24"/>
+              </w:rPr>
+              <w:t>Kecelakaan Lalu Lintas</w:t>
+            </w:r>
+            <w:r>
+              <w:rPr>
+                <w:rFonts w:ascii="Arial Narrow" w:hAnsi="Arial Narrow"/>
+                <w:sz w:val="24"/>
+                <w:szCs w:val="24"/>
+              </w:rPr>
+              <w:t xml:space="preserve"> sebagaimana dimaksud dalam</w:t>
+            </w:r>
+            <w:r>
+              <w:rPr>
+                <w:rFonts w:ascii="Arial Narrow" w:hAnsi="Arial Narrow"/>
+                <w:sz w:val="24"/>
+                <w:szCs w:val="24"/>
+              </w:rPr>
+              <w:t xml:space="preserve"> </w:t>
+            </w:r>
+            <w:r>
+              <w:rPr>
+                <w:rFonts w:ascii="Arial Narrow" w:hAnsi="Arial Narrow"/>
+                <w:sz w:val="24"/>
+                <w:szCs w:val="24"/>
+              </w:rPr>
+              <w:t>Undang-Undang Nomor 22 Tahun 2009, tentang Lalu Lintas dan Angkutan Jalan</w:t>
+            </w:r>
+            <w:r>
+              <w:rPr>
+                <w:rFonts w:ascii="Arial Narrow" w:hAnsi="Arial Narrow"/>
+                <w:sz w:val="24"/>
+                <w:szCs w:val="24"/>
+              </w:rPr>
+              <w:t>, dalam Pasal 273, Pasal 275(2), Pasal 310, Pasal 311, dan Pasal 312.</w:t>
             </w:r>
           </w:p>
         </w:tc>
@@ -1086,7 +1227,7 @@
                 <w:sz w:val="24"/>
                 <w:szCs w:val="24"/>
               </w:rPr>
-              <w:t>c.</w:t>
+              <w:t>3.</w:t>
             </w:r>
           </w:p>
         </w:tc>
@@ -1098,18 +1239,19 @@
             <w:pPr>
               <w:rPr>
                 <w:rFonts w:ascii="Arial Narrow" w:hAnsi="Arial Narrow"/>
-                <w:sz w:val="24"/>
-                <w:szCs w:val="24"/>
-              </w:rPr>
-            </w:pPr>
-            <w:r>
-              <w:rPr>
-                <w:rFonts w:ascii="Arial Narrow" w:hAnsi="Arial Narrow"/>
                 <w:color w:val="000000"/>
                 <w:sz w:val="24"/>
                 <w:szCs w:val="24"/>
               </w:rPr>
-              <w:t>Jam</w:t>
+            </w:pPr>
+            <w:r>
+              <w:rPr>
+                <w:rFonts w:ascii="Arial Narrow" w:hAnsi="Arial Narrow"/>
+                <w:color w:val="000000"/>
+                <w:sz w:val="24"/>
+                <w:szCs w:val="24"/>
+              </w:rPr>
+              <w:t>Perkara</w:t>
             </w:r>
           </w:p>
         </w:tc>
@@ -1138,23 +1280,22 @@
         <w:tc>
           <w:tcPr>
             <w:tcW w:w="6965" w:type="dxa"/>
-            <w:gridSpan w:val="4"/>
-          </w:tcPr>
-          <w:p>
-            <w:pPr>
-              <w:rPr>
-                <w:rFonts w:ascii="Arial Narrow" w:hAnsi="Arial Narrow"/>
-                <w:sz w:val="24"/>
-                <w:szCs w:val="24"/>
-              </w:rPr>
-            </w:pPr>
-            <w:r>
-              <w:rPr>
-                <w:rFonts w:ascii="Arial Narrow" w:hAnsi="Arial Narrow"/>
-                <w:sz w:val="24"/>
-                <w:szCs w:val="24"/>
-              </w:rPr>
-              <w:t>${time}</w:t>
+          </w:tcPr>
+          <w:p>
+            <w:pPr>
+              <w:rPr>
+                <w:rFonts w:ascii="Arial Narrow" w:hAnsi="Arial Narrow"/>
+                <w:sz w:val="24"/>
+                <w:szCs w:val="24"/>
+              </w:rPr>
+            </w:pPr>
+            <w:r>
+              <w:rPr>
+                <w:rFonts w:ascii="Arial Narrow" w:hAnsi="Arial Narrow"/>
+                <w:sz w:val="24"/>
+                <w:szCs w:val="24"/>
+              </w:rPr>
+              <w:t>${litigated}</w:t>
             </w:r>
           </w:p>
         </w:tc>
@@ -1192,7 +1333,15 @@
                 <w:sz w:val="24"/>
                 <w:szCs w:val="24"/>
               </w:rPr>
-              <w:t>d.</w:t>
+              <w:t>4</w:t>
+            </w:r>
+            <w:r>
+              <w:rPr>
+                <w:rFonts w:ascii="Arial Narrow" w:hAnsi="Arial Narrow"/>
+                <w:sz w:val="24"/>
+                <w:szCs w:val="24"/>
+              </w:rPr>
+              <w:t>.</w:t>
             </w:r>
           </w:p>
         </w:tc>
@@ -1215,7 +1364,25 @@
                 <w:sz w:val="24"/>
                 <w:szCs w:val="24"/>
               </w:rPr>
-              <w:t>Tempat</w:t>
+              <w:t>Hari</w:t>
+            </w:r>
+            <w:r>
+              <w:rPr>
+                <w:rFonts w:ascii="Arial Narrow" w:hAnsi="Arial Narrow"/>
+                <w:color w:val="000000"/>
+                <w:sz w:val="24"/>
+                <w:szCs w:val="24"/>
+              </w:rPr>
+              <w:t>/</w:t>
+            </w:r>
+            <w:r>
+              <w:rPr>
+                <w:rFonts w:ascii="Arial Narrow" w:hAnsi="Arial Narrow"/>
+                <w:color w:val="000000"/>
+                <w:sz w:val="24"/>
+                <w:szCs w:val="24"/>
+              </w:rPr>
+              <w:t>tanggal</w:t>
             </w:r>
           </w:p>
         </w:tc>
@@ -1244,23 +1411,22 @@
         <w:tc>
           <w:tcPr>
             <w:tcW w:w="6965" w:type="dxa"/>
-            <w:gridSpan w:val="4"/>
-          </w:tcPr>
-          <w:p>
-            <w:pPr>
-              <w:rPr>
-                <w:rFonts w:ascii="Arial Narrow" w:hAnsi="Arial Narrow"/>
-                <w:sz w:val="24"/>
-                <w:szCs w:val="24"/>
-              </w:rPr>
-            </w:pPr>
-            <w:r>
-              <w:rPr>
-                <w:rFonts w:ascii="Arial Narrow" w:hAnsi="Arial Narrow"/>
-                <w:sz w:val="24"/>
-                <w:szCs w:val="24"/>
-              </w:rPr>
-              <w:t>${place}</w:t>
+          </w:tcPr>
+          <w:p>
+            <w:pPr>
+              <w:rPr>
+                <w:rFonts w:ascii="Arial Narrow" w:hAnsi="Arial Narrow"/>
+                <w:sz w:val="24"/>
+                <w:szCs w:val="24"/>
+              </w:rPr>
+            </w:pPr>
+            <w:r>
+              <w:rPr>
+                <w:rFonts w:ascii="Arial Narrow" w:hAnsi="Arial Narrow"/>
+                <w:sz w:val="24"/>
+                <w:szCs w:val="24"/>
+              </w:rPr>
+              <w:t>${dayDate}</w:t>
             </w:r>
           </w:p>
         </w:tc>
@@ -1298,7 +1464,15 @@
                 <w:sz w:val="24"/>
                 <w:szCs w:val="24"/>
               </w:rPr>
-              <w:t>e.</w:t>
+              <w:t>5</w:t>
+            </w:r>
+            <w:r>
+              <w:rPr>
+                <w:rFonts w:ascii="Arial Narrow" w:hAnsi="Arial Narrow"/>
+                <w:sz w:val="24"/>
+                <w:szCs w:val="24"/>
+              </w:rPr>
+              <w:t>.</w:t>
             </w:r>
           </w:p>
         </w:tc>
@@ -1317,11 +1491,10 @@
             <w:r>
               <w:rPr>
                 <w:rFonts w:ascii="Arial Narrow" w:hAnsi="Arial Narrow"/>
-                <w:color w:val="000000"/>
-                <w:sz w:val="24"/>
-                <w:szCs w:val="24"/>
-              </w:rPr>
-              <w:t>Peserta gelar</w:t>
+                <w:sz w:val="24"/>
+                <w:szCs w:val="24"/>
+              </w:rPr>
+              <w:t>Waktu</w:t>
             </w:r>
           </w:p>
         </w:tc>
@@ -1349,90 +1522,23 @@
         </w:tc>
         <w:tc>
           <w:tcPr>
-            <w:tcW w:w="284" w:type="dxa"/>
-          </w:tcPr>
-          <w:p>
-            <w:pPr>
-              <w:rPr>
-                <w:rFonts w:ascii="Arial Narrow" w:hAnsi="Arial Narrow"/>
-                <w:sz w:val="24"/>
-                <w:szCs w:val="24"/>
-              </w:rPr>
-            </w:pPr>
-            <w:r>
-              <w:rPr>
-                <w:rFonts w:ascii="Arial Narrow" w:hAnsi="Arial Narrow"/>
-                <w:sz w:val="24"/>
-                <w:szCs w:val="24"/>
-              </w:rPr>
-              <w:t>a.</w:t>
-            </w:r>
-          </w:p>
-        </w:tc>
-        <w:tc>
-          <w:tcPr>
-            <w:tcW w:w="1417" w:type="dxa"/>
-          </w:tcPr>
-          <w:p>
-            <w:pPr>
-              <w:rPr>
-                <w:rFonts w:ascii="Arial Narrow" w:hAnsi="Arial Narrow"/>
-                <w:sz w:val="24"/>
-                <w:szCs w:val="24"/>
-              </w:rPr>
-            </w:pPr>
-            <w:r>
-              <w:rPr>
-                <w:rFonts w:ascii="Arial Narrow" w:hAnsi="Arial Narrow"/>
-                <w:color w:val="000000"/>
-                <w:sz w:val="24"/>
-                <w:szCs w:val="24"/>
-              </w:rPr>
-              <w:t>Pimpinan Gelar</w:t>
-            </w:r>
-          </w:p>
-        </w:tc>
-        <w:tc>
-          <w:tcPr>
-            <w:tcW w:w="142" w:type="dxa"/>
-          </w:tcPr>
-          <w:p>
-            <w:pPr>
-              <w:rPr>
-                <w:rFonts w:ascii="Arial Narrow" w:hAnsi="Arial Narrow"/>
-                <w:sz w:val="24"/>
-                <w:szCs w:val="24"/>
-              </w:rPr>
-            </w:pPr>
-            <w:r>
-              <w:rPr>
-                <w:rFonts w:ascii="Arial Narrow" w:hAnsi="Arial Narrow"/>
-                <w:sz w:val="24"/>
-                <w:szCs w:val="24"/>
-              </w:rPr>
-              <w:t>:</w:t>
-            </w:r>
-          </w:p>
-        </w:tc>
-        <w:tc>
-          <w:tcPr>
-            <w:tcW w:w="5122" w:type="dxa"/>
-          </w:tcPr>
-          <w:p>
-            <w:pPr>
-              <w:rPr>
-                <w:rFonts w:ascii="Arial Narrow" w:hAnsi="Arial Narrow"/>
-                <w:sz w:val="24"/>
-                <w:szCs w:val="24"/>
-              </w:rPr>
-            </w:pPr>
-            <w:r>
-              <w:rPr>
-                <w:rFonts w:ascii="Arial Narrow" w:hAnsi="Arial Narrow"/>
-                <w:sz w:val="24"/>
-                <w:szCs w:val="24"/>
-              </w:rPr>
-              <w:t>${caseDegreeLeader}</w:t>
+            <w:tcW w:w="6965" w:type="dxa"/>
+          </w:tcPr>
+          <w:p>
+            <w:pPr>
+              <w:rPr>
+                <w:rFonts w:ascii="Arial Narrow" w:hAnsi="Arial Narrow"/>
+                <w:sz w:val="24"/>
+                <w:szCs w:val="24"/>
+              </w:rPr>
+            </w:pPr>
+            <w:r>
+              <w:rPr>
+                <w:rFonts w:ascii="Arial Narrow" w:hAnsi="Arial Narrow"/>
+                <w:sz w:val="24"/>
+                <w:szCs w:val="24"/>
+              </w:rPr>
+              <w:t>${time}</w:t>
             </w:r>
           </w:p>
         </w:tc>
@@ -1464,6 +1570,22 @@
                 <w:szCs w:val="24"/>
               </w:rPr>
             </w:pPr>
+            <w:r>
+              <w:rPr>
+                <w:rFonts w:ascii="Arial Narrow" w:hAnsi="Arial Narrow"/>
+                <w:sz w:val="24"/>
+                <w:szCs w:val="24"/>
+              </w:rPr>
+              <w:t>6</w:t>
+            </w:r>
+            <w:r>
+              <w:rPr>
+                <w:rFonts w:ascii="Arial Narrow" w:hAnsi="Arial Narrow"/>
+                <w:sz w:val="24"/>
+                <w:szCs w:val="24"/>
+              </w:rPr>
+              <w:t>.</w:t>
+            </w:r>
           </w:p>
         </w:tc>
         <w:tc>
@@ -1474,11 +1596,19 @@
             <w:pPr>
               <w:rPr>
                 <w:rFonts w:ascii="Arial Narrow" w:hAnsi="Arial Narrow"/>
+                <w:sz w:val="24"/>
+                <w:szCs w:val="24"/>
+              </w:rPr>
+            </w:pPr>
+            <w:r>
+              <w:rPr>
+                <w:rFonts w:ascii="Arial Narrow" w:hAnsi="Arial Narrow"/>
                 <w:color w:val="000000"/>
                 <w:sz w:val="24"/>
                 <w:szCs w:val="24"/>
               </w:rPr>
-            </w:pPr>
+              <w:t>Tempat</w:t>
+            </w:r>
           </w:p>
         </w:tc>
         <w:tc>
@@ -1493,65 +1623,6 @@
                 <w:szCs w:val="24"/>
               </w:rPr>
             </w:pPr>
-          </w:p>
-        </w:tc>
-        <w:tc>
-          <w:tcPr>
-            <w:tcW w:w="284" w:type="dxa"/>
-          </w:tcPr>
-          <w:p>
-            <w:pPr>
-              <w:rPr>
-                <w:rFonts w:ascii="Arial Narrow" w:hAnsi="Arial Narrow"/>
-                <w:sz w:val="24"/>
-                <w:szCs w:val="24"/>
-              </w:rPr>
-            </w:pPr>
-            <w:r>
-              <w:rPr>
-                <w:rFonts w:ascii="Arial Narrow" w:hAnsi="Arial Narrow"/>
-                <w:sz w:val="24"/>
-                <w:szCs w:val="24"/>
-              </w:rPr>
-              <w:t>b.</w:t>
-            </w:r>
-          </w:p>
-        </w:tc>
-        <w:tc>
-          <w:tcPr>
-            <w:tcW w:w="1417" w:type="dxa"/>
-          </w:tcPr>
-          <w:p>
-            <w:pPr>
-              <w:rPr>
-                <w:rFonts w:ascii="Arial Narrow" w:hAnsi="Arial Narrow"/>
-                <w:sz w:val="24"/>
-                <w:szCs w:val="24"/>
-              </w:rPr>
-            </w:pPr>
-            <w:r>
-              <w:rPr>
-                <w:rFonts w:ascii="Arial Narrow" w:hAnsi="Arial Narrow"/>
-                <w:color w:val="000000"/>
-                <w:sz w:val="24"/>
-                <w:szCs w:val="24"/>
-              </w:rPr>
-              <w:t>Jumlah Peserta</w:t>
-            </w:r>
-          </w:p>
-        </w:tc>
-        <w:tc>
-          <w:tcPr>
-            <w:tcW w:w="142" w:type="dxa"/>
-          </w:tcPr>
-          <w:p>
-            <w:pPr>
-              <w:rPr>
-                <w:rFonts w:ascii="Arial Narrow" w:hAnsi="Arial Narrow"/>
-                <w:sz w:val="24"/>
-                <w:szCs w:val="24"/>
-              </w:rPr>
-            </w:pPr>
             <w:r>
               <w:rPr>
                 <w:rFonts w:ascii="Arial Narrow" w:hAnsi="Arial Narrow"/>
@@ -1564,39 +1635,23 @@
         </w:tc>
         <w:tc>
           <w:tcPr>
-            <w:tcW w:w="5122" w:type="dxa"/>
-          </w:tcPr>
-          <w:p>
-            <w:pPr>
-              <w:rPr>
-                <w:rFonts w:ascii="Arial Narrow" w:hAnsi="Arial Narrow"/>
-                <w:sz w:val="24"/>
-                <w:szCs w:val="24"/>
-              </w:rPr>
-            </w:pPr>
-            <w:r>
-              <w:rPr>
-                <w:rFonts w:ascii="Arial Narrow" w:hAnsi="Arial Narrow"/>
-                <w:sz w:val="24"/>
-                <w:szCs w:val="24"/>
-              </w:rPr>
-              <w:t>${</w:t>
-            </w:r>
-            <w:r>
-              <w:rPr>
-                <w:rFonts w:ascii="Arial Narrow" w:hAnsi="Arial Narrow"/>
-                <w:sz w:val="24"/>
-                <w:szCs w:val="24"/>
-              </w:rPr>
-              <w:t>attendees</w:t>
-            </w:r>
-            <w:r>
-              <w:rPr>
-                <w:rFonts w:ascii="Arial Narrow" w:hAnsi="Arial Narrow"/>
-                <w:sz w:val="24"/>
-                <w:szCs w:val="24"/>
-              </w:rPr>
-              <w:t>}</w:t>
+            <w:tcW w:w="6965" w:type="dxa"/>
+          </w:tcPr>
+          <w:p>
+            <w:pPr>
+              <w:rPr>
+                <w:rFonts w:ascii="Arial Narrow" w:hAnsi="Arial Narrow"/>
+                <w:sz w:val="24"/>
+                <w:szCs w:val="24"/>
+              </w:rPr>
+            </w:pPr>
+            <w:r>
+              <w:rPr>
+                <w:rFonts w:ascii="Arial Narrow" w:hAnsi="Arial Narrow"/>
+                <w:sz w:val="24"/>
+                <w:szCs w:val="24"/>
+              </w:rPr>
+              <w:t>${place}</w:t>
             </w:r>
           </w:p>
         </w:tc>
@@ -1604,8 +1659,316 @@
       <w:tr>
         <w:tc>
           <w:tcPr>
+            <w:tcW w:w="284" w:type="dxa"/>
+          </w:tcPr>
+          <w:p>
+            <w:pPr>
+              <w:rPr>
+                <w:rFonts w:ascii="Arial Narrow" w:hAnsi="Arial Narrow"/>
+                <w:sz w:val="24"/>
+                <w:szCs w:val="24"/>
+              </w:rPr>
+            </w:pPr>
+          </w:p>
+        </w:tc>
+        <w:tc>
+          <w:tcPr>
+            <w:tcW w:w="283" w:type="dxa"/>
+          </w:tcPr>
+          <w:p>
+            <w:pPr>
+              <w:rPr>
+                <w:rFonts w:ascii="Arial Narrow" w:hAnsi="Arial Narrow"/>
+                <w:sz w:val="24"/>
+                <w:szCs w:val="24"/>
+              </w:rPr>
+            </w:pPr>
+            <w:r>
+              <w:rPr>
+                <w:rFonts w:ascii="Arial Narrow" w:hAnsi="Arial Narrow"/>
+                <w:sz w:val="24"/>
+                <w:szCs w:val="24"/>
+              </w:rPr>
+              <w:t>7</w:t>
+            </w:r>
+            <w:r>
+              <w:rPr>
+                <w:rFonts w:ascii="Arial Narrow" w:hAnsi="Arial Narrow"/>
+                <w:sz w:val="24"/>
+                <w:szCs w:val="24"/>
+              </w:rPr>
+              <w:t>.</w:t>
+            </w:r>
+          </w:p>
+        </w:tc>
+        <w:tc>
+          <w:tcPr>
+            <w:tcW w:w="2127" w:type="dxa"/>
+          </w:tcPr>
+          <w:p>
+            <w:pPr>
+              <w:rPr>
+                <w:rFonts w:ascii="Arial Narrow" w:hAnsi="Arial Narrow"/>
+                <w:color w:val="000000"/>
+                <w:sz w:val="24"/>
+                <w:szCs w:val="24"/>
+              </w:rPr>
+            </w:pPr>
+            <w:r>
+              <w:rPr>
+                <w:rFonts w:ascii="Arial Narrow" w:hAnsi="Arial Narrow"/>
+                <w:color w:val="000000"/>
+                <w:sz w:val="24"/>
+                <w:szCs w:val="24"/>
+              </w:rPr>
+              <w:t>Pimpinan gelar</w:t>
+            </w:r>
+          </w:p>
+        </w:tc>
+        <w:tc>
+          <w:tcPr>
+            <w:tcW w:w="141" w:type="dxa"/>
+          </w:tcPr>
+          <w:p>
+            <w:pPr>
+              <w:rPr>
+                <w:rFonts w:ascii="Arial Narrow" w:hAnsi="Arial Narrow"/>
+                <w:sz w:val="24"/>
+                <w:szCs w:val="24"/>
+              </w:rPr>
+            </w:pPr>
+            <w:r>
+              <w:rPr>
+                <w:rFonts w:ascii="Arial Narrow" w:hAnsi="Arial Narrow"/>
+                <w:sz w:val="24"/>
+                <w:szCs w:val="24"/>
+              </w:rPr>
+              <w:t>:</w:t>
+            </w:r>
+          </w:p>
+        </w:tc>
+        <w:tc>
+          <w:tcPr>
+            <w:tcW w:w="6965" w:type="dxa"/>
+          </w:tcPr>
+          <w:p>
+            <w:pPr>
+              <w:rPr>
+                <w:rFonts w:ascii="Arial Narrow" w:hAnsi="Arial Narrow"/>
+                <w:sz w:val="24"/>
+                <w:szCs w:val="24"/>
+              </w:rPr>
+            </w:pPr>
+            <w:r>
+              <w:rPr>
+                <w:rFonts w:ascii="Arial Narrow" w:hAnsi="Arial Narrow"/>
+                <w:sz w:val="24"/>
+                <w:szCs w:val="24"/>
+              </w:rPr>
+              <w:t>${caseDegreeLeader}</w:t>
+            </w:r>
+          </w:p>
+        </w:tc>
+      </w:tr>
+      <w:tr>
+        <w:trPr>
+          <w:gridAfter w:val="1"/>
+          <w:wAfter w:w="6965" w:type="dxa"/>
+          <w:trHeight w:val="350"/>
+        </w:trPr>
+        <w:tc>
+          <w:tcPr>
+            <w:tcW w:w="284" w:type="dxa"/>
+          </w:tcPr>
+          <w:p>
+            <w:pPr>
+              <w:rPr>
+                <w:rFonts w:ascii="Arial Narrow" w:hAnsi="Arial Narrow"/>
+                <w:sz w:val="24"/>
+                <w:szCs w:val="24"/>
+              </w:rPr>
+            </w:pPr>
+          </w:p>
+        </w:tc>
+        <w:tc>
+          <w:tcPr>
+            <w:tcW w:w="283" w:type="dxa"/>
+          </w:tcPr>
+          <w:p>
+            <w:pPr>
+              <w:rPr>
+                <w:rFonts w:ascii="Arial Narrow" w:hAnsi="Arial Narrow"/>
+                <w:sz w:val="24"/>
+                <w:szCs w:val="24"/>
+              </w:rPr>
+            </w:pPr>
+            <w:r>
+              <w:rPr>
+                <w:rFonts w:ascii="Arial Narrow" w:hAnsi="Arial Narrow"/>
+                <w:sz w:val="24"/>
+                <w:szCs w:val="24"/>
+              </w:rPr>
+              <w:t>8</w:t>
+            </w:r>
+            <w:r>
+              <w:rPr>
+                <w:rFonts w:ascii="Arial Narrow" w:hAnsi="Arial Narrow"/>
+                <w:sz w:val="24"/>
+                <w:szCs w:val="24"/>
+              </w:rPr>
+              <w:t>.</w:t>
+            </w:r>
+          </w:p>
+        </w:tc>
+        <w:tc>
+          <w:tcPr>
+            <w:tcW w:w="2127" w:type="dxa"/>
+          </w:tcPr>
+          <w:p>
+            <w:pPr>
+              <w:rPr>
+                <w:rFonts w:ascii="Arial Narrow" w:hAnsi="Arial Narrow"/>
+                <w:sz w:val="24"/>
+                <w:szCs w:val="24"/>
+              </w:rPr>
+            </w:pPr>
+            <w:r>
+              <w:rPr>
+                <w:rFonts w:ascii="Arial Narrow" w:hAnsi="Arial Narrow"/>
+                <w:color w:val="000000"/>
+                <w:sz w:val="24"/>
+                <w:szCs w:val="24"/>
+              </w:rPr>
+              <w:t>Peserta gelar</w:t>
+            </w:r>
+          </w:p>
+        </w:tc>
+        <w:tc>
+          <w:tcPr>
+            <w:tcW w:w="141" w:type="dxa"/>
+          </w:tcPr>
+          <w:p>
+            <w:pPr>
+              <w:rPr>
+                <w:rFonts w:ascii="Arial Narrow" w:hAnsi="Arial Narrow"/>
+                <w:sz w:val="24"/>
+                <w:szCs w:val="24"/>
+              </w:rPr>
+            </w:pPr>
+            <w:r>
+              <w:rPr>
+                <w:rFonts w:ascii="Arial Narrow" w:hAnsi="Arial Narrow"/>
+                <w:sz w:val="24"/>
+                <w:szCs w:val="24"/>
+              </w:rPr>
+              <w:t>:</w:t>
+            </w:r>
+          </w:p>
+        </w:tc>
+      </w:tr>
+      <w:tr>
+        <w:tc>
+          <w:tcPr>
+            <w:tcW w:w="284" w:type="dxa"/>
+          </w:tcPr>
+          <w:p>
+            <w:pPr>
+              <w:rPr>
+                <w:rFonts w:ascii="Arial Narrow" w:hAnsi="Arial Narrow"/>
+                <w:sz w:val="24"/>
+                <w:szCs w:val="24"/>
+              </w:rPr>
+            </w:pPr>
+          </w:p>
+        </w:tc>
+        <w:tc>
+          <w:tcPr>
+            <w:tcW w:w="283" w:type="dxa"/>
+          </w:tcPr>
+          <w:p>
+            <w:pPr>
+              <w:rPr>
+                <w:rFonts w:ascii="Arial Narrow" w:hAnsi="Arial Narrow"/>
+                <w:sz w:val="24"/>
+                <w:szCs w:val="24"/>
+              </w:rPr>
+            </w:pPr>
+          </w:p>
+        </w:tc>
+        <w:tc>
+          <w:tcPr>
+            <w:tcW w:w="9233" w:type="dxa"/>
+            <w:gridSpan w:val="3"/>
+          </w:tcPr>
+          <w:p>
+            <w:r>
+              <w:t>${block_</w:t>
+            </w:r>
+            <w:r>
+              <w:t>attendances</w:t>
+            </w:r>
+            <w:r>
+              <w:t>}</w:t>
+            </w:r>
+          </w:p>
+          <w:p>
+            <w:pPr>
+              <w:rPr>
+                <w:rFonts w:ascii="Arial" w:hAnsi="Arial" w:cs="Arial" w:hint="cs"/>
+                <w:sz w:val="24"/>
+                <w:szCs w:val="24"/>
+              </w:rPr>
+            </w:pPr>
+            <w:r>
+              <w:rPr>
+                <w:rFonts w:ascii="Arial" w:hAnsi="Arial" w:cs="Arial" w:hint="cs"/>
+                <w:sz w:val="24"/>
+                <w:szCs w:val="24"/>
+              </w:rPr>
+              <w:t>${numbers}.</w:t>
+            </w:r>
+            <w:r>
+              <w:rPr>
+                <w:rFonts w:ascii="Arial" w:hAnsi="Arial" w:cs="Arial" w:hint="cs"/>
+                <w:sz w:val="24"/>
+                <w:szCs w:val="24"/>
+              </w:rPr>
+              <w:t xml:space="preserve"> </w:t>
+            </w:r>
+            <w:r>
+              <w:rPr>
+                <w:rFonts w:ascii="Arial" w:hAnsi="Arial" w:cs="Arial" w:hint="cs"/>
+                <w:sz w:val="24"/>
+                <w:szCs w:val="24"/>
+              </w:rPr>
+              <w:t>${attendance}</w:t>
+            </w:r>
+          </w:p>
+          <w:p>
+            <w:pPr>
+              <w:rPr>
+                <w:rFonts w:ascii="Arial Narrow" w:hAnsi="Arial Narrow"/>
+                <w:sz w:val="24"/>
+                <w:szCs w:val="24"/>
+              </w:rPr>
+            </w:pPr>
+            <w:r>
+              <w:t>${/block_</w:t>
+            </w:r>
+            <w:r>
+              <w:t>attendances</w:t>
+            </w:r>
+            <w:r>
+              <w:t>}</w:t>
+            </w:r>
+          </w:p>
+        </w:tc>
+      </w:tr>
+      <w:tr>
+        <w:tc>
+          <w:tcPr>
             <w:tcW w:w="9800" w:type="dxa"/>
-            <w:gridSpan w:val="8"/>
+            <w:gridSpan w:val="5"/>
           </w:tcPr>
           <w:p>
             <w:pPr>
@@ -1644,7 +2007,7 @@
         <w:tc>
           <w:tcPr>
             <w:tcW w:w="9516" w:type="dxa"/>
-            <w:gridSpan w:val="7"/>
+            <w:gridSpan w:val="4"/>
           </w:tcPr>
           <w:p>
             <w:pPr>
@@ -1684,7 +2047,7 @@
         <w:tc>
           <w:tcPr>
             <w:tcW w:w="9516" w:type="dxa"/>
-            <w:gridSpan w:val="7"/>
+            <w:gridSpan w:val="4"/>
           </w:tcPr>
           <w:p>
             <w:pPr>
@@ -1725,7 +2088,7 @@
         <w:tc>
           <w:tcPr>
             <w:tcW w:w="9800" w:type="dxa"/>
-            <w:gridSpan w:val="8"/>
+            <w:gridSpan w:val="5"/>
           </w:tcPr>
           <w:p>
             <w:pPr>
@@ -1764,7 +2127,7 @@
         <w:tc>
           <w:tcPr>
             <w:tcW w:w="9516" w:type="dxa"/>
-            <w:gridSpan w:val="7"/>
+            <w:gridSpan w:val="4"/>
           </w:tcPr>
           <w:p>
             <w:pPr>
@@ -1804,7 +2167,7 @@
         <w:tc>
           <w:tcPr>
             <w:tcW w:w="9516" w:type="dxa"/>
-            <w:gridSpan w:val="7"/>
+            <w:gridSpan w:val="4"/>
           </w:tcPr>
           <w:p>
             <w:pPr>
@@ -1845,7 +2208,7 @@
         <w:tc>
           <w:tcPr>
             <w:tcW w:w="9800" w:type="dxa"/>
-            <w:gridSpan w:val="8"/>
+            <w:gridSpan w:val="5"/>
           </w:tcPr>
           <w:p>
             <w:pPr>
@@ -1884,7 +2247,7 @@
         <w:tc>
           <w:tcPr>
             <w:tcW w:w="9516" w:type="dxa"/>
-            <w:gridSpan w:val="7"/>
+            <w:gridSpan w:val="4"/>
           </w:tcPr>
           <w:p>
             <w:pPr>
@@ -1924,7 +2287,7 @@
         <w:tc>
           <w:tcPr>
             <w:tcW w:w="9516" w:type="dxa"/>
-            <w:gridSpan w:val="7"/>
+            <w:gridSpan w:val="4"/>
           </w:tcPr>
           <w:p>
             <w:pPr>
@@ -1979,10 +2342,7 @@
     <w:tbl>
       <w:tblPr>
         <w:tblStyle w:val="TableGrid"/>
-        <w:tblpPr w:leftFromText="180" w:rightFromText="180" w:vertAnchor="text" w:tblpXSpec="right" w:tblpY="1"/>
-        <w:tblOverlap w:val="never"/>
         <w:tblW w:w="0" w:type="auto"/>
-        <w:jc w:val="right"/>
         <w:tblBorders>
           <w:top w:val="none" w:sz="0" w:space="0" w:color="auto"/>
           <w:left w:val="none" w:sz="0" w:space="0" w:color="auto"/>
@@ -1991,26 +2351,73 @@
           <w:insideH w:val="none" w:sz="0" w:space="0" w:color="auto"/>
           <w:insideV w:val="none" w:sz="0" w:space="0" w:color="auto"/>
         </w:tblBorders>
-        <w:tblCellMar>
-          <w:left w:w="0" w:type="dxa"/>
-          <w:right w:w="0" w:type="dxa"/>
-        </w:tblCellMar>
         <w:tblLook w:val="04A0" w:firstRow="1" w:lastRow="0" w:firstColumn="1" w:lastColumn="0" w:noHBand="0" w:noVBand="1"/>
       </w:tblPr>
       <w:tblGrid>
-        <w:gridCol w:w="5021"/>
+        <w:gridCol w:w="3964"/>
+        <w:gridCol w:w="1423"/>
+        <w:gridCol w:w="4384"/>
       </w:tblGrid>
       <w:tr>
-        <w:trPr>
-          <w:jc w:val="right"/>
-        </w:trPr>
-        <w:tc>
-          <w:tcPr>
-            <w:tcW w:w="0" w:type="auto"/>
+        <w:tc>
+          <w:tcPr>
+            <w:tcW w:w="3964" w:type="dxa"/>
           </w:tcPr>
           <w:p>
             <w:pPr>
               <w:jc w:val="center"/>
+              <w:rPr>
+                <w:rFonts w:ascii="Arial Narrow" w:hAnsi="Arial Narrow"/>
+                <w:sz w:val="16"/>
+                <w:szCs w:val="16"/>
+              </w:rPr>
+            </w:pPr>
+            <w:r>
+              <w:rPr>
+                <w:rFonts w:ascii="Arial Narrow" w:hAnsi="Arial Narrow"/>
+                <w:sz w:val="24"/>
+                <w:szCs w:val="24"/>
+              </w:rPr>
+              <w:t>Mengetahui:</w:t>
+            </w:r>
+            <w:r>
+              <w:rPr>
+                <w:rFonts w:ascii="Arial Narrow" w:hAnsi="Arial Narrow"/>
+                <w:sz w:val="24"/>
+                <w:szCs w:val="24"/>
+              </w:rPr>
+              <w:t xml:space="preserve"> </w:t>
+            </w:r>
+          </w:p>
+        </w:tc>
+        <w:tc>
+          <w:tcPr>
+            <w:tcW w:w="1423" w:type="dxa"/>
+          </w:tcPr>
+          <w:p>
+            <w:pPr>
+              <w:rPr>
+                <w:rFonts w:ascii="Arial Narrow" w:hAnsi="Arial Narrow"/>
+                <w:sz w:val="16"/>
+                <w:szCs w:val="16"/>
+              </w:rPr>
+            </w:pPr>
+          </w:p>
+        </w:tc>
+        <w:tc>
+          <w:tcPr>
+            <w:tcW w:w="4384" w:type="dxa"/>
+          </w:tcPr>
+          <w:p>
+            <w:pPr>
+              <w:jc w:val="center"/>
+              <w:rPr>
+                <w:rFonts w:ascii="Arial Narrow" w:hAnsi="Arial Narrow"/>
+                <w:sz w:val="16"/>
+                <w:szCs w:val="16"/>
+              </w:rPr>
+            </w:pPr>
+            <w:r>
               <w:rPr>
                 <w:rFonts w:ascii="Arial Narrow" w:eastAsia="Arial Narrow" w:hAnsi="Arial Narrow"/>
                 <w:bCs/>
@@ -2018,7 +2425,8 @@
                 <w:sz w:val="24"/>
                 <w:szCs w:val="24"/>
               </w:rPr>
-            </w:pPr>
+              <w:t>${location_created}</w:t>
+            </w:r>
             <w:r>
               <w:rPr>
                 <w:rFonts w:ascii="Arial Narrow" w:eastAsia="Arial Narrow" w:hAnsi="Arial Narrow"/>
@@ -2027,7 +2435,7 @@
                 <w:sz w:val="24"/>
                 <w:szCs w:val="24"/>
               </w:rPr>
-              <w:t>${documentLocation}</w:t>
+              <w:t xml:space="preserve">, </w:t>
             </w:r>
             <w:r>
               <w:rPr>
@@ -2037,9 +2445,56 @@
                 <w:sz w:val="24"/>
                 <w:szCs w:val="24"/>
               </w:rPr>
-              <w:t xml:space="preserve">, </w:t>
-            </w:r>
-            <w:r>
+              <w:t>${issued_date}</w:t>
+            </w:r>
+          </w:p>
+        </w:tc>
+      </w:tr>
+      <w:tr>
+        <w:tc>
+          <w:tcPr>
+            <w:tcW w:w="3964" w:type="dxa"/>
+          </w:tcPr>
+          <w:p>
+            <w:pPr>
+              <w:jc w:val="center"/>
+              <w:rPr>
+                <w:rFonts w:ascii="Arial Narrow" w:hAnsi="Arial Narrow"/>
+                <w:sz w:val="24"/>
+                <w:szCs w:val="24"/>
+              </w:rPr>
+            </w:pPr>
+            <w:r>
+              <w:rPr>
+                <w:rFonts w:ascii="Arial Narrow" w:hAnsi="Arial Narrow"/>
+                <w:sz w:val="24"/>
+                <w:szCs w:val="24"/>
+              </w:rPr>
+              <w:t>Pimpinan Gelar Perkara,</w:t>
+            </w:r>
+          </w:p>
+        </w:tc>
+        <w:tc>
+          <w:tcPr>
+            <w:tcW w:w="1423" w:type="dxa"/>
+          </w:tcPr>
+          <w:p>
+            <w:pPr>
+              <w:rPr>
+                <w:rFonts w:ascii="Arial Narrow" w:hAnsi="Arial Narrow"/>
+                <w:sz w:val="16"/>
+                <w:szCs w:val="16"/>
+              </w:rPr>
+            </w:pPr>
+          </w:p>
+        </w:tc>
+        <w:tc>
+          <w:tcPr>
+            <w:tcW w:w="4384" w:type="dxa"/>
+          </w:tcPr>
+          <w:p>
+            <w:pPr>
+              <w:jc w:val="center"/>
               <w:rPr>
                 <w:rFonts w:ascii="Arial Narrow" w:eastAsia="Arial Narrow" w:hAnsi="Arial Narrow"/>
                 <w:bCs/>
@@ -2047,22 +2502,8 @@
                 <w:sz w:val="24"/>
                 <w:szCs w:val="24"/>
               </w:rPr>
-              <w:t>${documentDate}</w:t>
-            </w:r>
-          </w:p>
-        </w:tc>
-      </w:tr>
-      <w:tr>
-        <w:trPr>
-          <w:jc w:val="right"/>
-        </w:trPr>
-        <w:tc>
-          <w:tcPr>
-            <w:tcW w:w="0" w:type="auto"/>
-          </w:tcPr>
-          <w:p>
-            <w:pPr>
-              <w:jc w:val="center"/>
+            </w:pPr>
+            <w:r>
               <w:rPr>
                 <w:rFonts w:ascii="Arial Narrow" w:eastAsia="Arial Narrow" w:hAnsi="Arial Narrow"/>
                 <w:bCs/>
@@ -2070,30 +2511,9 @@
                 <w:sz w:val="24"/>
                 <w:szCs w:val="24"/>
               </w:rPr>
-            </w:pPr>
-            <w:r>
-              <w:rPr>
-                <w:rFonts w:ascii="Arial Narrow" w:hAnsi="Arial Narrow"/>
-                <w:color w:val="000000"/>
-                <w:sz w:val="24"/>
-                <w:szCs w:val="24"/>
-              </w:rPr>
-              <w:t>Pimpinan Gelar,</w:t>
-            </w:r>
-          </w:p>
-        </w:tc>
-      </w:tr>
-      <w:tr>
-        <w:trPr>
-          <w:jc w:val="right"/>
-        </w:trPr>
-        <w:tc>
-          <w:tcPr>
-            <w:tcW w:w="0" w:type="auto"/>
-          </w:tcPr>
-          <w:p>
-            <w:pPr>
-              <w:jc w:val="center"/>
+              <w:t>Notulen</w:t>
+            </w:r>
+            <w:r>
               <w:rPr>
                 <w:rFonts w:ascii="Arial Narrow" w:eastAsia="Arial Narrow" w:hAnsi="Arial Narrow"/>
                 <w:bCs/>
@@ -2101,17 +2521,44 @@
                 <w:sz w:val="24"/>
                 <w:szCs w:val="24"/>
               </w:rPr>
-            </w:pPr>
+              <w:t>,</w:t>
+            </w:r>
           </w:p>
         </w:tc>
       </w:tr>
       <w:tr>
-        <w:trPr>
-          <w:jc w:val="right"/>
-        </w:trPr>
-        <w:tc>
-          <w:tcPr>
-            <w:tcW w:w="0" w:type="auto"/>
+        <w:tc>
+          <w:tcPr>
+            <w:tcW w:w="3964" w:type="dxa"/>
+          </w:tcPr>
+          <w:p>
+            <w:pPr>
+              <w:jc w:val="center"/>
+              <w:rPr>
+                <w:rFonts w:ascii="Arial Narrow" w:hAnsi="Arial Narrow"/>
+                <w:sz w:val="24"/>
+                <w:szCs w:val="24"/>
+              </w:rPr>
+            </w:pPr>
+          </w:p>
+        </w:tc>
+        <w:tc>
+          <w:tcPr>
+            <w:tcW w:w="1423" w:type="dxa"/>
+          </w:tcPr>
+          <w:p>
+            <w:pPr>
+              <w:rPr>
+                <w:rFonts w:ascii="Arial Narrow" w:hAnsi="Arial Narrow"/>
+                <w:sz w:val="16"/>
+                <w:szCs w:val="16"/>
+              </w:rPr>
+            </w:pPr>
+          </w:p>
+        </w:tc>
+        <w:tc>
+          <w:tcPr>
+            <w:tcW w:w="4384" w:type="dxa"/>
           </w:tcPr>
           <w:p>
             <w:pPr>
@@ -2128,12 +2575,38 @@
         </w:tc>
       </w:tr>
       <w:tr>
-        <w:trPr>
-          <w:jc w:val="right"/>
-        </w:trPr>
-        <w:tc>
-          <w:tcPr>
-            <w:tcW w:w="0" w:type="auto"/>
+        <w:tc>
+          <w:tcPr>
+            <w:tcW w:w="3964" w:type="dxa"/>
+          </w:tcPr>
+          <w:p>
+            <w:pPr>
+              <w:jc w:val="center"/>
+              <w:rPr>
+                <w:rFonts w:ascii="Arial Narrow" w:hAnsi="Arial Narrow"/>
+                <w:sz w:val="24"/>
+                <w:szCs w:val="24"/>
+              </w:rPr>
+            </w:pPr>
+          </w:p>
+        </w:tc>
+        <w:tc>
+          <w:tcPr>
+            <w:tcW w:w="1423" w:type="dxa"/>
+          </w:tcPr>
+          <w:p>
+            <w:pPr>
+              <w:rPr>
+                <w:rFonts w:ascii="Arial Narrow" w:hAnsi="Arial Narrow"/>
+                <w:sz w:val="16"/>
+                <w:szCs w:val="16"/>
+              </w:rPr>
+            </w:pPr>
+          </w:p>
+        </w:tc>
+        <w:tc>
+          <w:tcPr>
+            <w:tcW w:w="4384" w:type="dxa"/>
           </w:tcPr>
           <w:p>
             <w:pPr>
@@ -2150,12 +2623,38 @@
         </w:tc>
       </w:tr>
       <w:tr>
-        <w:trPr>
-          <w:jc w:val="right"/>
-        </w:trPr>
-        <w:tc>
-          <w:tcPr>
-            <w:tcW w:w="0" w:type="auto"/>
+        <w:tc>
+          <w:tcPr>
+            <w:tcW w:w="3964" w:type="dxa"/>
+          </w:tcPr>
+          <w:p>
+            <w:pPr>
+              <w:jc w:val="center"/>
+              <w:rPr>
+                <w:rFonts w:ascii="Arial Narrow" w:hAnsi="Arial Narrow"/>
+                <w:sz w:val="24"/>
+                <w:szCs w:val="24"/>
+              </w:rPr>
+            </w:pPr>
+          </w:p>
+        </w:tc>
+        <w:tc>
+          <w:tcPr>
+            <w:tcW w:w="1423" w:type="dxa"/>
+          </w:tcPr>
+          <w:p>
+            <w:pPr>
+              <w:rPr>
+                <w:rFonts w:ascii="Arial Narrow" w:hAnsi="Arial Narrow"/>
+                <w:sz w:val="16"/>
+                <w:szCs w:val="16"/>
+              </w:rPr>
+            </w:pPr>
+          </w:p>
+        </w:tc>
+        <w:tc>
+          <w:tcPr>
+            <w:tcW w:w="4384" w:type="dxa"/>
           </w:tcPr>
           <w:p>
             <w:pPr>
@@ -2172,12 +2671,38 @@
         </w:tc>
       </w:tr>
       <w:tr>
-        <w:trPr>
-          <w:jc w:val="right"/>
-        </w:trPr>
-        <w:tc>
-          <w:tcPr>
-            <w:tcW w:w="0" w:type="auto"/>
+        <w:tc>
+          <w:tcPr>
+            <w:tcW w:w="3964" w:type="dxa"/>
+          </w:tcPr>
+          <w:p>
+            <w:pPr>
+              <w:jc w:val="center"/>
+              <w:rPr>
+                <w:rFonts w:ascii="Arial Narrow" w:hAnsi="Arial Narrow"/>
+                <w:sz w:val="24"/>
+                <w:szCs w:val="24"/>
+              </w:rPr>
+            </w:pPr>
+          </w:p>
+        </w:tc>
+        <w:tc>
+          <w:tcPr>
+            <w:tcW w:w="1423" w:type="dxa"/>
+          </w:tcPr>
+          <w:p>
+            <w:pPr>
+              <w:rPr>
+                <w:rFonts w:ascii="Arial Narrow" w:hAnsi="Arial Narrow"/>
+                <w:sz w:val="16"/>
+                <w:szCs w:val="16"/>
+              </w:rPr>
+            </w:pPr>
+          </w:p>
+        </w:tc>
+        <w:tc>
+          <w:tcPr>
+            <w:tcW w:w="4384" w:type="dxa"/>
           </w:tcPr>
           <w:p>
             <w:pPr>
@@ -2194,12 +2719,57 @@
         </w:tc>
       </w:tr>
       <w:tr>
-        <w:trPr>
-          <w:jc w:val="right"/>
-        </w:trPr>
-        <w:tc>
-          <w:tcPr>
-            <w:tcW w:w="0" w:type="auto"/>
+        <w:tc>
+          <w:tcPr>
+            <w:tcW w:w="3964" w:type="dxa"/>
+          </w:tcPr>
+          <w:p>
+            <w:pPr>
+              <w:jc w:val="center"/>
+              <w:rPr>
+                <w:rFonts w:ascii="Arial Narrow" w:hAnsi="Arial Narrow"/>
+                <w:sz w:val="24"/>
+                <w:szCs w:val="24"/>
+              </w:rPr>
+            </w:pPr>
+          </w:p>
+        </w:tc>
+        <w:tc>
+          <w:tcPr>
+            <w:tcW w:w="1423" w:type="dxa"/>
+          </w:tcPr>
+          <w:p>
+            <w:pPr>
+              <w:rPr>
+                <w:rFonts w:ascii="Arial Narrow" w:hAnsi="Arial Narrow"/>
+                <w:sz w:val="16"/>
+                <w:szCs w:val="16"/>
+              </w:rPr>
+            </w:pPr>
+          </w:p>
+        </w:tc>
+        <w:tc>
+          <w:tcPr>
+            <w:tcW w:w="4384" w:type="dxa"/>
+          </w:tcPr>
+          <w:p>
+            <w:pPr>
+              <w:jc w:val="center"/>
+              <w:rPr>
+                <w:rFonts w:ascii="Arial Narrow" w:eastAsia="Arial Narrow" w:hAnsi="Arial Narrow"/>
+                <w:bCs/>
+                <w:color w:val="000000"/>
+                <w:sz w:val="24"/>
+                <w:szCs w:val="24"/>
+              </w:rPr>
+            </w:pPr>
+          </w:p>
+        </w:tc>
+      </w:tr>
+      <w:tr>
+        <w:tc>
+          <w:tcPr>
+            <w:tcW w:w="3964" w:type="dxa"/>
             <w:tcBorders>
               <w:bottom w:val="single" w:sz="4" w:space="0" w:color="auto"/>
             </w:tcBorders>
@@ -2208,33 +2778,94 @@
             <w:pPr>
               <w:jc w:val="center"/>
               <w:rPr>
+                <w:rFonts w:ascii="Arial Narrow" w:hAnsi="Arial Narrow"/>
+                <w:b/>
+                <w:bCs/>
+                <w:sz w:val="24"/>
+                <w:szCs w:val="24"/>
+              </w:rPr>
+            </w:pPr>
+            <w:r>
+              <w:rPr>
+                <w:rFonts w:ascii="Arial Narrow" w:hAnsi="Arial Narrow"/>
+                <w:b/>
+                <w:bCs/>
+                <w:sz w:val="24"/>
+                <w:szCs w:val="24"/>
+              </w:rPr>
+              <w:t>${signatoryName}</w:t>
+            </w:r>
+          </w:p>
+        </w:tc>
+        <w:tc>
+          <w:tcPr>
+            <w:tcW w:w="1423" w:type="dxa"/>
+          </w:tcPr>
+          <w:p>
+            <w:pPr>
+              <w:rPr>
+                <w:rFonts w:ascii="Arial Narrow" w:hAnsi="Arial Narrow"/>
+                <w:sz w:val="16"/>
+                <w:szCs w:val="16"/>
+              </w:rPr>
+            </w:pPr>
+          </w:p>
+        </w:tc>
+        <w:tc>
+          <w:tcPr>
+            <w:tcW w:w="4384" w:type="dxa"/>
+            <w:tcBorders>
+              <w:bottom w:val="single" w:sz="4" w:space="0" w:color="auto"/>
+            </w:tcBorders>
+          </w:tcPr>
+          <w:p>
+            <w:pPr>
+              <w:jc w:val="center"/>
+              <w:rPr>
                 <w:rFonts w:ascii="Arial Narrow" w:eastAsia="Arial Narrow" w:hAnsi="Arial Narrow"/>
+                <w:bCs/>
+                <w:color w:val="000000"/>
+                <w:sz w:val="24"/>
+                <w:szCs w:val="24"/>
+              </w:rPr>
+            </w:pPr>
+            <w:r>
+              <w:rPr>
+                <w:rFonts w:ascii="Arial Narrow" w:hAnsi="Arial Narrow"/>
                 <w:b/>
-                <w:color w:val="000000"/>
-                <w:sz w:val="24"/>
-                <w:szCs w:val="24"/>
-              </w:rPr>
-            </w:pPr>
-            <w:r>
-              <w:rPr>
-                <w:rFonts w:ascii="Arial Narrow" w:eastAsia="Arial Narrow" w:hAnsi="Arial Narrow"/>
+                <w:bCs/>
+                <w:sz w:val="24"/>
+                <w:szCs w:val="24"/>
+              </w:rPr>
+              <w:t>${</w:t>
+            </w:r>
+            <w:r>
+              <w:rPr>
+                <w:rFonts w:ascii="Arial Narrow" w:hAnsi="Arial Narrow"/>
                 <w:b/>
-                <w:color w:val="000000"/>
-                <w:sz w:val="24"/>
-                <w:szCs w:val="24"/>
-              </w:rPr>
-              <w:t>${signatoryName}</w:t>
+                <w:bCs/>
+                <w:sz w:val="24"/>
+                <w:szCs w:val="24"/>
+              </w:rPr>
+              <w:t>notulen</w:t>
+            </w:r>
+            <w:r>
+              <w:rPr>
+                <w:rFonts w:ascii="Arial Narrow" w:hAnsi="Arial Narrow"/>
+                <w:b/>
+                <w:bCs/>
+                <w:sz w:val="24"/>
+                <w:szCs w:val="24"/>
+              </w:rPr>
+              <w:t>Name}</w:t>
             </w:r>
           </w:p>
         </w:tc>
       </w:tr>
       <w:tr>
-        <w:trPr>
-          <w:jc w:val="right"/>
-        </w:trPr>
-        <w:tc>
-          <w:tcPr>
-            <w:tcW w:w="0" w:type="auto"/>
+        <w:tc>
+          <w:tcPr>
+            <w:tcW w:w="3964" w:type="dxa"/>
             <w:tcBorders>
               <w:top w:val="single" w:sz="4" w:space="0" w:color="auto"/>
             </w:tcBorders>
@@ -2243,6 +2874,48 @@
             <w:pPr>
               <w:jc w:val="center"/>
               <w:rPr>
+                <w:rFonts w:ascii="Arial Narrow" w:hAnsi="Arial Narrow"/>
+                <w:b/>
+                <w:bCs/>
+                <w:sz w:val="24"/>
+                <w:szCs w:val="24"/>
+              </w:rPr>
+            </w:pPr>
+            <w:r>
+              <w:rPr>
+                <w:rFonts w:ascii="Arial Narrow" w:hAnsi="Arial Narrow"/>
+                <w:sz w:val="24"/>
+                <w:szCs w:val="24"/>
+              </w:rPr>
+              <w:t>${signatoryRankName} NRP ${signatoryRegisterNumber}</w:t>
+            </w:r>
+          </w:p>
+        </w:tc>
+        <w:tc>
+          <w:tcPr>
+            <w:tcW w:w="1423" w:type="dxa"/>
+          </w:tcPr>
+          <w:p>
+            <w:pPr>
+              <w:rPr>
+                <w:rFonts w:ascii="Arial Narrow" w:hAnsi="Arial Narrow"/>
+                <w:sz w:val="16"/>
+                <w:szCs w:val="16"/>
+              </w:rPr>
+            </w:pPr>
+          </w:p>
+        </w:tc>
+        <w:tc>
+          <w:tcPr>
+            <w:tcW w:w="4384" w:type="dxa"/>
+            <w:tcBorders>
+              <w:top w:val="single" w:sz="4" w:space="0" w:color="auto"/>
+            </w:tcBorders>
+          </w:tcPr>
+          <w:p>
+            <w:pPr>
+              <w:jc w:val="center"/>
+              <w:rPr>
                 <w:rFonts w:ascii="Arial Narrow" w:eastAsia="Arial Narrow" w:hAnsi="Arial Narrow"/>
                 <w:bCs/>
                 <w:color w:val="000000"/>
@@ -2252,38 +2925,58 @@
             </w:pPr>
             <w:r>
               <w:rPr>
-                <w:rFonts w:ascii="Arial Narrow" w:eastAsia="Arial Narrow" w:hAnsi="Arial Narrow"/>
-                <w:bCs/>
-                <w:color w:val="000000"/>
-                <w:sz w:val="24"/>
-                <w:szCs w:val="24"/>
-              </w:rPr>
-              <w:t>${signatoryRankName}</w:t>
-            </w:r>
-            <w:r>
-              <w:rPr>
-                <w:rFonts w:ascii="Arial Narrow" w:eastAsia="Arial Narrow" w:hAnsi="Arial Narrow"/>
-                <w:bCs/>
-                <w:color w:val="000000"/>
-                <w:sz w:val="24"/>
-                <w:szCs w:val="24"/>
-              </w:rPr>
-              <w:t xml:space="preserve"> NRP </w:t>
-            </w:r>
-            <w:r>
-              <w:rPr>
-                <w:rFonts w:ascii="Arial Narrow" w:eastAsia="Arial Narrow" w:hAnsi="Arial Narrow"/>
-                <w:bCs/>
-                <w:color w:val="000000"/>
-                <w:sz w:val="24"/>
-                <w:szCs w:val="24"/>
-              </w:rPr>
-              <w:t>${signatoryRegisterNumber}</w:t>
+                <w:rFonts w:ascii="Arial Narrow" w:hAnsi="Arial Narrow"/>
+                <w:sz w:val="24"/>
+                <w:szCs w:val="24"/>
+              </w:rPr>
+              <w:t>${</w:t>
+            </w:r>
+            <w:r>
+              <w:rPr>
+                <w:rFonts w:ascii="Arial Narrow" w:hAnsi="Arial Narrow"/>
+                <w:sz w:val="24"/>
+                <w:szCs w:val="24"/>
+              </w:rPr>
+              <w:t>notulen</w:t>
+            </w:r>
+            <w:r>
+              <w:rPr>
+                <w:rFonts w:ascii="Arial Narrow" w:hAnsi="Arial Narrow"/>
+                <w:sz w:val="24"/>
+                <w:szCs w:val="24"/>
+              </w:rPr>
+              <w:t>RankName} NRP ${</w:t>
+            </w:r>
+            <w:r>
+              <w:rPr>
+                <w:rFonts w:ascii="Arial Narrow" w:hAnsi="Arial Narrow"/>
+                <w:sz w:val="24"/>
+                <w:szCs w:val="24"/>
+              </w:rPr>
+              <w:t>notulen</w:t>
+            </w:r>
+            <w:r>
+              <w:rPr>
+                <w:rFonts w:ascii="Arial Narrow" w:hAnsi="Arial Narrow"/>
+                <w:sz w:val="24"/>
+                <w:szCs w:val="24"/>
+              </w:rPr>
+              <w:t>RegisterNumber}</w:t>
             </w:r>
           </w:p>
         </w:tc>
       </w:tr>
     </w:tbl>
+    <w:p>
+      <w:pPr>
+        <w:spacing w:after="0" w:line="240" w:lineRule="auto"/>
+        <w:rPr>
+          <w:rFonts w:ascii="Arial Narrow" w:hAnsi="Arial Narrow"/>
+          <w:sz w:val="16"/>
+          <w:szCs w:val="16"/>
+        </w:rPr>
+      </w:pPr>
+    </w:p>
     <w:p>
       <w:pPr>
         <w:spacing w:after="0" w:line="240" w:lineRule="auto"/>
@@ -2324,7 +3017,7 @@
 </file>
 
 <file path=word/styles.xml><?xml version="1.0" encoding="utf-8"?>
-<w:styles xmlns:mc="http://schemas.openxmlformats.org/markup-compatibility/2006" xmlns:r="http://schemas.openxmlformats.org/officeDocument/2006/relationships" xmlns:w="http://schemas.openxmlformats.org/wordprocessingml/2006/main" xmlns:w14="http://schemas.microsoft.com/office/word/2010/wordml" xmlns:w15="http://schemas.microsoft.com/office/word/2012/wordml" xmlns:w16cex="http://schemas.microsoft.com/office/word/2018/wordml/cex" xmlns:w16cid="http://schemas.microsoft.com/office/word/2016/wordml/cid" xmlns:w16="http://schemas.microsoft.com/office/word/2018/wordml" xmlns:w16du="http://schemas.microsoft.com/office/word/2023/wordml/word16du" xmlns:w16sdtdh="http://schemas.microsoft.com/office/word/2020/wordml/sdtdatahash" xmlns:w16se="http://schemas.microsoft.com/office/word/2015/wordml/symex" mc:Ignorable="w14 w15 w16se w16cid w16 w16cex w16sdtdh w16du">
+<w:styles xmlns:mc="http://schemas.openxmlformats.org/markup-compatibility/2006" xmlns:r="http://schemas.openxmlformats.org/officeDocument/2006/relationships" xmlns:w="http://schemas.openxmlformats.org/wordprocessingml/2006/main" xmlns:w14="http://schemas.microsoft.com/office/word/2010/wordml" xmlns:w15="http://schemas.microsoft.com/office/word/2012/wordml" xmlns:w16cex="http://schemas.microsoft.com/office/word/2018/wordml/cex" xmlns:w16cid="http://schemas.microsoft.com/office/word/2016/wordml/cid" xmlns:w16="http://schemas.microsoft.com/office/word/2018/wordml" xmlns:w16du="http://schemas.microsoft.com/office/word/2023/wordml/word16du" xmlns:w16sdtdh="http://schemas.microsoft.com/office/word/2020/wordml/sdtdatahash" xmlns:w16sdtfl="http://schemas.microsoft.com/office/word/2024/wordml/sdtformatlock" xmlns:w16se="http://schemas.microsoft.com/office/word/2015/wordml/symex" mc:Ignorable="w14 w15 w16se w16cid w16 w16cex w16sdtdh w16sdtfl w16du">
   <w:docDefaults>
     <w:rPrDefault>
       <w:rPr>

</xml_diff>